<commit_message>
Add writing guidelines and revise class 3 design explanation
</commit_message>
<xml_diff>
--- a/第3次课实践任务/设计说明_第3次课.docx
+++ b/第3次课实践任务/设计说明_第3次课.docx
@@ -12,22 +12,17 @@
     </w:p>
     <w:p>
       <w:r>
-        <w:t>我在第二次课工程上增加三类变化。借阅规则采用策略模式，学生、教师和VIP分别校验上限，通过注册表选择，新增类型无需改已有规则。</w:t>
+        <w:t>借阅上限由独立策略校验，学生、教师和VIP分别使用5本、10本和15本规则。注册表按读者类型选择策略，新增类型时只补充策略和装配，原有规则保持稳定。VIP上限采用本次工程约定。</w:t>
       </w:r>
     </w:p>
     <w:p>
       <w:r>
-        <w:t>借阅服务采用模板方法，固定查找、校验、借出、保存、成功扩展及通知的顺序。标准服务不追加处理，审计服务仅覆盖成功钩子；保存失败恢复图书状态，不产生审计或通知。</w:t>
+        <w:t>标准与审计借阅共用模板方法，固定校验、借出、保存、成功扩展和通知的顺序，审计服务仅覆盖保存后的成功钩子。保存失败时恢复图书状态，并跳过审计与通知。图书采用状态模式，由可借、借出、预约和维修状态处理合法动作，预约人可以借出或取消，非法动作保持原状态。</w:t>
       </w:r>
     </w:p>
     <w:p>
       <w:r>
-        <w:t>图书采用状态模式，由可借、借出、预约、维修状态决定合法动作与迁移。预约仅允许预约人借出或取消，非法动作保持原状态。</w:t>
-      </w:r>
-    </w:p>
-    <w:p>
-      <w:r>
-        <w:t>原有SMS与Email通知仍可替换。代价是策略、状态类增加及继承耦合。验证保留旧行为，并覆盖规则边界、保存失败和全部状态动作组合。VIP上限暂定15本，具体细则见README。</w:t>
+        <w:t>验证保留第二次课用例，补充上限边界、保存失败和24种状态动作组合检查。代价是规则、状态类增加，以及审计服务对父类流程的依赖。</w:t>
       </w:r>
     </w:p>
     <w:sectPr>

</xml_diff>

<commit_message>
Complete class 3 using the official starter and assignment
</commit_message>
<xml_diff>
--- a/第3次课实践任务/设计说明_第3次课.docx
+++ b/第3次课实践任务/设计说明_第3次课.docx
@@ -12,17 +12,17 @@
     </w:p>
     <w:p>
       <w:r>
-        <w:t>借阅上限由独立策略校验，学生、教师和VIP分别使用5本、10本和15本规则。注册表按读者类型选择策略，新增类型时只补充策略和装配，原有规则保持稳定。VIP上限采用本次工程约定。</w:t>
+        <w:t>借阅规则采用策略模式，学生、教师和VIP分别校验额度、受限图书权限及借期，新增读者类型时增加策略和登记，已有规则保持原样。VIP普通图书60天、受限图书30天。</w:t>
       </w:r>
     </w:p>
     <w:p>
       <w:r>
-        <w:t>标准与审计借阅共用模板方法，固定校验、借出、保存、成功扩展和通知的顺序，审计服务仅覆盖保存后的成功钩子。保存失败时恢复图书状态，并跳过审计与通知。图书采用状态模式，由可借、借出、预约和维修状态处理合法动作，预约人可以借出或取消，非法动作保持原状态。</w:t>
+        <w:t>标准与审计借阅共用模板方法，按查找、规则判断、状态变更、保存和通知的顺序执行，审计在通知成功后追加。规则、状态或保存失败时跳过成功审计，保存失败保留已完成操作。状态模式将图书动作分配给可借、借出、预约和维修状态，借出图书可预约，预约后可完成借出或取消，非法动作保留原状态。</w:t>
       </w:r>
     </w:p>
     <w:p>
       <w:r>
-        <w:t>验证保留第二次课用例，补充上限边界、保存失败和24种状态动作组合检查。代价是规则、状态类增加，以及审计服务对父类流程的依赖。</w:t>
+        <w:t>成本是策略、状态类增加及子类对模板流程的依赖。原4项基线测试完整保留，57项测试覆盖借期权限、额度边界、失败副作用和28种状态动作组合。</w:t>
       </w:r>
     </w:p>
     <w:sectPr>

</xml_diff>